<commit_message>
docs: refresh public assessment documentation
</commit_message>
<xml_diff>
--- a/docs/ATO_Bot_Technical_White_Paper_2026-07-06.docx
+++ b/docs/ATO_Bot_Technical_White_Paper_2026-07-06.docx
@@ -178,7 +178,7 @@
         <w:pStyle w:val="ListBullet"/>
       </w:pPr>
       <w:r>
-        <w:t>9. Integrations and Telemetry Surfaces</w:t>
+        <w:t>9. Operational Observability and Optional Security-Posture Surfaces</w:t>
       </w:r>
     </w:p>
     <w:p>
@@ -385,7 +385,7 @@
           <w:color w:val="1F2937"/>
           <w:sz w:val="24"/>
         </w:rPr>
-        <w:t>9. Integrations and Telemetry Surfaces</w:t>
+        <w:t>9. Operational Observability and Optional Security-Posture Surfaces</w:t>
       </w:r>
     </w:p>
     <w:p>
@@ -930,7 +930,7 @@
           <w:color w:val="1F2937"/>
           <w:sz w:val="22"/>
         </w:rPr>
-        <w:t>System Knowledge, Architecture and Tools, Integrations, telemetry, and operational monitoring scaffolding.</w:t>
+        <w:t>System Knowledge, Architecture and Tools, optional integrations, and operational-observability scaffolding.</w:t>
       </w:r>
     </w:p>
     <w:p>
@@ -999,7 +999,7 @@
                 <w:color w:val="1F2937"/>
                 <w:sz w:val="21"/>
               </w:rPr>
-              <w:t>The flagship path today is governed full assessment review. Ingestion is the preparation layer for that engine, while telemetry and adjacent monitoring surfaces are meaningful extensions of the broader platform.</w:t>
+              <w:t>The flagship path today is governed full assessment review. Ingestion is the preparation layer for that engine, while operational observability helps operators understand application health, job state, audit activity, configuration changes, and processing status. Optional security-posture integrations are disabled by default and are outside the supported assessment claim.</w:t>
             </w:r>
           </w:p>
         </w:tc>
@@ -4940,7 +4940,7 @@
           <w:color w:val="1F2937"/>
           <w:sz w:val="22"/>
         </w:rPr>
-        <w:t>The final band is mixed because some of these capabilities are strongly model-driven while others are deterministic-adjacent but essential to the same system story. The band includes synthetic dataset generation, security telemetry guidance generation, system knowledge extraction, SSP composition, artifact validation, and the calibration harness. These flows are important because they help the platform test itself, explain itself, and turn assessment outcomes into longer-lived knowledge and reporting products.</w:t>
+        <w:t>The final band is mixed because some of these capabilities are strongly model-driven while others are deterministic-adjacent but essential to the same system story. The band includes synthetic dataset generation, optional security-posture guidance generation, system knowledge extraction, SSP composition, artifact validation, and the calibration harness. These flows are important because they help the platform test itself, explain itself, and turn assessment outcomes into longer-lived knowledge and reporting products.</w:t>
       </w:r>
     </w:p>
     <w:p>
@@ -5069,7 +5069,7 @@
         <w:spacing w:before="120" w:after="40"/>
       </w:pPr>
       <w:r>
-        <w:t>Security telemetry guidance generation</w:t>
+        <w:t>Optional security-posture guidance generation</w:t>
       </w:r>
     </w:p>
     <w:p>
@@ -5082,7 +5082,7 @@
           <w:color w:val="1F2937"/>
           <w:sz w:val="22"/>
         </w:rPr>
-        <w:t>Most telemetry handling is deterministic, but the platform can still ask a model to translate structured security findings into clearer operator-facing guidance. This is a bounded translation role, not a delegation of telemetry authority to the model.</w:t>
+        <w:t>Most of this optional security-posture subsystem is deterministic, but when enabled the platform can ask a model to translate structured security findings into clearer operator-facing guidance. This is a bounded translation role, not a supported assessment function or a continuous-authorization capability.</w:t>
       </w:r>
     </w:p>
     <w:p>
@@ -5096,7 +5096,7 @@
           <w:color w:val="1F2937"/>
           <w:sz w:val="22"/>
         </w:rPr>
-        <w:t>Runtime purpose: translate structured telemetry or verification observations into operator-facing collection and response guidance.</w:t>
+        <w:t>Runtime purpose: translate structured security-posture or verification observations into operator-facing collection and response guidance.</w:t>
       </w:r>
     </w:p>
     <w:p>
@@ -5110,7 +5110,7 @@
           <w:color w:val="1F2937"/>
           <w:sz w:val="22"/>
         </w:rPr>
-        <w:t>Entry points: telemetry guidance workflows, verification views, and integration-oriented operator surfaces.</w:t>
+        <w:t>Entry points: optional security-posture guidance workflows, verification views, and integration-oriented operator surfaces.</w:t>
       </w:r>
     </w:p>
     <w:p>
@@ -5152,7 +5152,7 @@
           <w:color w:val="1F2937"/>
           <w:sz w:val="22"/>
         </w:rPr>
-        <w:t>Deterministic governance: security finding assembly, severity handling, and telemetry storage remain code-driven.</w:t>
+        <w:t>Deterministic governance: security finding assembly, severity handling, and optional security-posture storage remain code-driven.</w:t>
       </w:r>
     </w:p>
     <w:p>
@@ -5166,7 +5166,7 @@
           <w:color w:val="1F2937"/>
           <w:sz w:val="22"/>
         </w:rPr>
-        <w:t>Persisted state: guidance can be attached to telemetry-facing workflows or related report surfaces.</w:t>
+        <w:t>Persisted state: guidance can be attached to optional security-posture workflows or related report surfaces.</w:t>
       </w:r>
     </w:p>
     <w:p>
@@ -5715,7 +5715,7 @@
         <w:spacing w:before="160" w:after="80"/>
       </w:pPr>
       <w:r>
-        <w:t>9. Integrations and Telemetry Surfaces</w:t>
+        <w:t>9. Operational Observability and Optional Security-Posture Surfaces</w:t>
       </w:r>
     </w:p>
     <w:p>
@@ -5728,7 +5728,7 @@
           <w:color w:val="1F2937"/>
           <w:sz w:val="22"/>
         </w:rPr>
-        <w:t>ATO Bot already contains explicit integration and telemetry objects that point beyond static package assessment. The data model and route structure include integration accounts and runs, telemetry snapshots, control telemetry posture, drift records, security collectors and assets, and verification results.</w:t>
+        <w:t>ATO Bot records operational-observability data around the supported assessment workflow, including service health, job state, audit activity, configuration changes, and processing failures. The codebase also retains a separately gated integration and security-posture subsystem with objects for integration accounts and runs, posture snapshots, drift records, security collectors and assets, and verification results.</w:t>
       </w:r>
     </w:p>
     <w:p>
@@ -5741,7 +5741,7 @@
           <w:color w:val="1F2937"/>
           <w:sz w:val="22"/>
         </w:rPr>
-        <w:t>Technically, that means the product is not boxed into one-time document review. It has the object model and UI scaffolding necessary to correlate assessed control posture with operational security state over time, even if some of those integrations remain less mature than the evidence-to-assessment core.</w:t>
+        <w:t>The supported observability layer helps operators determine whether the assessment workflow is available and trustworthy. The optional security-posture subsystem is not part of the supported evidence-to-assessment claim and must not be presented as continuous authorization monitoring.</w:t>
       </w:r>
     </w:p>
     <w:p>
@@ -5769,7 +5769,7 @@
           <w:color w:val="1F2937"/>
           <w:sz w:val="22"/>
         </w:rPr>
-        <w:t>Operational telemetry objects for surfacing posture beyond a single assessment event.</w:t>
+        <w:t>Operational-observability records for service, job, audit, configuration, and processing status.</w:t>
       </w:r>
     </w:p>
     <w:p>
@@ -5783,7 +5783,7 @@
           <w:color w:val="1F2937"/>
           <w:sz w:val="22"/>
         </w:rPr>
-        <w:t>Security telemetry guidance generation for translating control intent into operational collection targets.</w:t>
+        <w:t>Optional security-posture guidance generation for translating structured findings into collection targets.</w:t>
       </w:r>
     </w:p>
     <w:p>
@@ -5797,7 +5797,7 @@
           <w:color w:val="1F2937"/>
           <w:sz w:val="22"/>
         </w:rPr>
-        <w:t>Verification, drift, and snapshot objects for monitoring whether previously assessed posture still appears true.</w:t>
+        <w:t>Gated verification, drift, and snapshot objects retained for future security-posture work.</w:t>
       </w:r>
     </w:p>
     <w:p>
@@ -5810,7 +5810,7 @@
           <w:color w:val="1F2937"/>
           <w:sz w:val="22"/>
         </w:rPr>
-        <w:t>The most credible way to position this path is as an extension of the same evidence model. Static artifacts, operational telemetry, and generated reports all become evidence inputs with different cadence and provenance. That architecture is substantially stronger than treating telemetry as a disconnected monitoring surface separate from assessment logic.</w:t>
+        <w:t>The most credible way to position the supported layer is as operational observability around the assessment record. It tells operators whether processing is current and whether audit and workflow state are available. The separate security-posture subsystem remains a disabled expansion lane rather than a claim of continuous authorization.</w:t>
       </w:r>
     </w:p>
     <w:p>
@@ -5962,7 +5962,7 @@
           <w:color w:val="1F2937"/>
           <w:sz w:val="22"/>
         </w:rPr>
-        <w:t>Telemetry-facing monitoring and some system-knowledge flows are meaningful but not yet as mature as the core assessment experience.</w:t>
+        <w:t>Optional security-posture monitoring and some system-knowledge flows are meaningful but not yet as mature as the core assessment experience.</w:t>
       </w:r>
     </w:p>
     <w:p>
@@ -6024,7 +6024,7 @@
           <w:color w:val="1F2937"/>
           <w:sz w:val="22"/>
         </w:rPr>
-        <w:t>That architecture gives the product a stronger technical posture than systems that jump directly from upload to narrative. The platform is already broad enough to support document libraries, assessment execution, remediation, SSP and OSCAL outputs, system knowledge, integrations, and telemetry-informed monitoring. Its core differentiator is therefore not generic AI capability but the combination of provenance, bounded orchestration, deterministic governance, and operationally useful review surfaces.</w:t>
+        <w:t>That architecture gives the product a stronger technical posture than systems that jump directly from upload to narrative. The platform is already broad enough to support document libraries, assessment execution, remediation, SSP and OSCAL outputs, system knowledge, optional integrations, and operational observability. Its core differentiator is therefore not generic AI capability but the combination of provenance, bounded orchestration, deterministic governance, and operationally useful review surfaces.</w:t>
       </w:r>
     </w:p>
     <w:p>
@@ -6193,7 +6193,7 @@
           </w:tcPr>
           <w:p>
             <w:r>
-              <w:t>Dashboard</w:t>
+              <w:t>Navigate</w:t>
             </w:r>
           </w:p>
         </w:tc>
@@ -6289,7 +6289,7 @@
           </w:tcPr>
           <w:p>
             <w:r>
-              <w:t>IntegrationsPage</w:t>
+              <w:t>OptionalSecurityPostureRoute</w:t>
             </w:r>
           </w:p>
         </w:tc>
@@ -7155,6 +7155,28 @@
           </w:tcPr>
           <w:p>
             <w:r>
+              <w:t>assessment_governance</w:t>
+            </w:r>
+          </w:p>
+        </w:tc>
+        <w:tc>
+          <w:tcPr>
+            <w:tcW w:type="dxa" w:w="4896"/>
+          </w:tcPr>
+          <w:p>
+            <w:r>
+              <w:t>API module</w:t>
+            </w:r>
+          </w:p>
+        </w:tc>
+      </w:tr>
+      <w:tr>
+        <w:tc>
+          <w:tcPr>
+            <w:tcW w:type="dxa" w:w="4896"/>
+          </w:tcPr>
+          <w:p>
+            <w:r>
               <w:t>assessment_policy</w:t>
             </w:r>
           </w:p>
@@ -7463,6 +7485,28 @@
           </w:tcPr>
           <w:p>
             <w:r>
+              <w:t>meta</w:t>
+            </w:r>
+          </w:p>
+        </w:tc>
+        <w:tc>
+          <w:tcPr>
+            <w:tcW w:type="dxa" w:w="4896"/>
+          </w:tcPr>
+          <w:p>
+            <w:r>
+              <w:t>API module</w:t>
+            </w:r>
+          </w:p>
+        </w:tc>
+      </w:tr>
+      <w:tr>
+        <w:tc>
+          <w:tcPr>
+            <w:tcW w:type="dxa" w:w="4896"/>
+          </w:tcPr>
+          <w:p>
+            <w:r>
               <w:t>overrides</w:t>
             </w:r>
           </w:p>
@@ -7785,6 +7829,28 @@
           <w:p>
             <w:r>
               <w:t>assessment_engine</w:t>
+            </w:r>
+          </w:p>
+        </w:tc>
+        <w:tc>
+          <w:tcPr>
+            <w:tcW w:type="dxa" w:w="4896"/>
+          </w:tcPr>
+          <w:p>
+            <w:r>
+              <w:t>Service module</w:t>
+            </w:r>
+          </w:p>
+        </w:tc>
+      </w:tr>
+      <w:tr>
+        <w:tc>
+          <w:tcPr>
+            <w:tcW w:type="dxa" w:w="4896"/>
+          </w:tcPr>
+          <w:p>
+            <w:r>
+              <w:t>assessment_governance</w:t>
             </w:r>
           </w:p>
         </w:tc>
@@ -8827,7 +8893,7 @@
           </w:tcPr>
           <w:p>
             <w:r>
-              <w:t>Integrations and telemetry</w:t>
+              <w:t>Optional security-posture data</w:t>
             </w:r>
           </w:p>
         </w:tc>
@@ -9062,7 +9128,7 @@
           </w:tcPr>
           <w:p>
             <w:r>
-              <w:t>Telemetry correlation, deeper integration automation, and broader continuous verification loops</w:t>
+              <w:t>Optional security-posture correlation, deeper integration automation, and broader verification loops</w:t>
             </w:r>
           </w:p>
         </w:tc>

</xml_diff>